<commit_message>
Tests figure edits and tables
</commit_message>
<xml_diff>
--- a/calkit/tests/fixtures/docx/accepted.docx
+++ b/calkit/tests/fixtures/docx/accepted.docx
@@ -113,7 +113,7 @@
         <w:spacing w:after="640"/>
         <w:ind w:left="-5"/>
       </w:pPr>
-      <w:bookmarkStart w:id="5" w:name="ck_defc3a7a_23"/>
+      <w:bookmarkStart w:id="5" w:name="ck_defc3a7a_19"/>
       <w:bookmarkEnd w:id="5"/>
       <w:r>
         <w:t xml:space="preserve">Wakes matter for wind farm layout, </w:t>
@@ -178,7 +178,7 @@
         <w:spacing w:after="194"/>
         <w:ind w:left="209"/>
       </w:pPr>
-      <w:bookmarkStart w:id="8" w:name="ck_dcf9e526_13"/>
+      <w:bookmarkStart w:id="8" w:name="ck_dcf9e526_14"/>
       <w:bookmarkEnd w:id="8"/>
       <w:commentRangeStart w:id="9"/>
       <w:commentRangeStart w:id="10"/>
@@ -226,7 +226,7 @@
           <w:noProof/>
         </w:rPr>
         <w:drawing>
-          <wp:inline distT="0" distB="0" distL="0" distR="0" wp14:anchorId="2A666D8C" wp14:editId="36855C77">
+          <wp:inline distT="0" distB="0" distL="0" distR="0" wp14:anchorId="5947D23A" wp14:editId="3358D609">
             <wp:extent cx="1161288" cy="298704"/>
             <wp:effectExtent l="0" t="0" r="0" b="0"/>
             <wp:docPr id="1788" name="Picture 1788"/>
@@ -279,7 +279,7 @@
       <w:pPr>
         <w:ind w:left="-5"/>
       </w:pPr>
-      <w:bookmarkStart w:id="11" w:name="ck_dcf9e526_17"/>
+      <w:bookmarkStart w:id="11" w:name="ck_dcf9e526_18"/>
       <w:bookmarkEnd w:id="11"/>
       <w:r>
         <w:t xml:space="preserve">where </w:t>
@@ -325,7 +325,7 @@
         <mc:AlternateContent>
           <mc:Choice Requires="wpg">
             <w:drawing>
-              <wp:inline distT="0" distB="0" distL="0" distR="0" wp14:anchorId="35391B72" wp14:editId="6ADEB290">
+              <wp:inline distT="0" distB="0" distL="0" distR="0" wp14:anchorId="7217DE60" wp14:editId="18BAF12E">
                 <wp:extent cx="2344959" cy="1697648"/>
                 <wp:effectExtent l="0" t="0" r="0" b="0"/>
                 <wp:docPr id="1448" name="Group 1448"/>
@@ -2341,7 +2341,7 @@
           </mc:Choice>
           <mc:Fallback>
             <w:pict>
-              <v:group w14:anchorId="35391B72" id="Group 1448" o:spid="_x0000_s1026" style="width:184.65pt;height:133.65pt;mso-position-horizontal-relative:char;mso-position-vertical-relative:line" coordsize="23449,16976" o:gfxdata="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">
+              <v:group w14:anchorId="7217DE60" id="Group 1448" o:spid="_x0000_s1026" style="width:184.65pt;height:133.65pt;mso-position-horizontal-relative:char;mso-position-vertical-relative:line" coordsize="23449,16976" o:gfxdata="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">
                 <v:shape id="Shape 64" o:spid="_x0000_s1027" style="position:absolute;left:4116;top:15092;width:0;height:198;visibility:visible;mso-wrap-style:square;v-text-anchor:top" coordsize="0,19850" o:gfxdata="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" path="m,19850l,,,19850xe" fillcolor="black" strokeweight=".126mm">
                   <v:path arrowok="t" textboxrect="0,0,0,19850"/>
                 </v:shape>
@@ -2912,6 +2912,8 @@
         <w:ind w:left="0" w:firstLine="0"/>
         <w:jc w:val="left"/>
       </w:pPr>
+      <w:bookmarkStart w:id="14" w:name="ck_defc3a7a_40"/>
+      <w:bookmarkEnd w:id="14"/>
       <w:r>
         <w:rPr>
           <w:rFonts w:ascii="Calibri" w:eastAsia="Calibri" w:hAnsi="Calibri" w:cs="Calibri"/>
@@ -2946,7 +2948,7 @@
         <mc:AlternateContent>
           <mc:Choice Requires="wpg">
             <w:drawing>
-              <wp:inline distT="0" distB="0" distL="0" distR="0" wp14:anchorId="7C752975" wp14:editId="35C463F7">
+              <wp:inline distT="0" distB="0" distL="0" distR="0" wp14:anchorId="56C31F31" wp14:editId="16907E75">
                 <wp:extent cx="2147075" cy="6325"/>
                 <wp:effectExtent l="0" t="0" r="0" b="0"/>
                 <wp:docPr id="1449" name="Group 1449"/>
@@ -3038,8 +3040,8 @@
         <w:ind w:left="0" w:firstLine="0"/>
         <w:jc w:val="left"/>
       </w:pPr>
-      <w:bookmarkStart w:id="14" w:name="ck_defc3a7a_40"/>
-      <w:bookmarkEnd w:id="14"/>
+      <w:bookmarkStart w:id="15" w:name="ck_defc3a7a_40_2"/>
+      <w:bookmarkEnd w:id="15"/>
       <w:r>
         <w:rPr>
           <w:rFonts w:ascii="Calibri" w:eastAsia="Calibri" w:hAnsi="Calibri" w:cs="Calibri"/>
@@ -3088,8 +3090,8 @@
         <w:ind w:left="0" w:firstLine="0"/>
         <w:jc w:val="left"/>
       </w:pPr>
-      <w:bookmarkStart w:id="15" w:name="ck_defc3a7a_40_2"/>
-      <w:bookmarkEnd w:id="15"/>
+      <w:bookmarkStart w:id="16" w:name="ck_defc3a7a_40_3"/>
+      <w:bookmarkEnd w:id="16"/>
       <w:r>
         <w:rPr>
           <w:rFonts w:ascii="Calibri" w:eastAsia="Calibri" w:hAnsi="Calibri" w:cs="Calibri"/>
@@ -3134,7 +3136,7 @@
         <mc:AlternateContent>
           <mc:Choice Requires="wpg">
             <w:drawing>
-              <wp:inline distT="0" distB="0" distL="0" distR="0" wp14:anchorId="4A3BDB50" wp14:editId="75596B12">
+              <wp:inline distT="0" distB="0" distL="0" distR="0" wp14:anchorId="4050184F" wp14:editId="5BC16551">
                 <wp:extent cx="2147075" cy="10122"/>
                 <wp:effectExtent l="0" t="0" r="0" b="0"/>
                 <wp:docPr id="1450" name="Group 1450"/>
@@ -3221,8 +3223,8 @@
         <w:spacing w:after="85"/>
         <w:ind w:left="633" w:hanging="484"/>
       </w:pPr>
-      <w:bookmarkStart w:id="16" w:name="ck_defc3a7a_50"/>
-      <w:bookmarkEnd w:id="16"/>
+      <w:bookmarkStart w:id="17" w:name="ck_defc3a7a_50"/>
+      <w:bookmarkEnd w:id="17"/>
       <w:r>
         <w:t>Conclusions</w:t>
       </w:r>
@@ -3232,20 +3234,20 @@
         <w:spacing w:after="405"/>
         <w:ind w:left="159"/>
       </w:pPr>
-      <w:bookmarkStart w:id="17" w:name="ck_defc3a7a_52"/>
-      <w:bookmarkEnd w:id="17"/>
-      <w:commentRangeStart w:id="18"/>
+      <w:bookmarkStart w:id="18" w:name="ck_defc3a7a_52"/>
+      <w:bookmarkEnd w:id="18"/>
+      <w:commentRangeStart w:id="19"/>
       <w:r>
         <w:t>The model in Eq. (1) fits the data in Sec. 2 reasonably well.</w:t>
       </w:r>
-      <w:commentRangeEnd w:id="18"/>
+      <w:commentRangeEnd w:id="19"/>
       <w:r>
         <w:rPr>
           <w:rStyle w:val="CommentReference"/>
           <w:sz w:val="20"/>
           <w:szCs w:val="24"/>
         </w:rPr>
-        <w:commentReference w:id="18"/>
+        <w:commentReference w:id="19"/>
       </w:r>
     </w:p>
     <w:p>
@@ -3339,7 +3341,7 @@
       </w:r>
     </w:p>
   </w:comment>
-  <w:comment w:id="18" w:author="A. Reviewer" w:date="2026-09-06T19:19:00Z" w:initials="">
+  <w:comment w:id="19" w:author="A. Reviewer" w:date="2026-09-06T22:26:00Z" w:initials="">
     <w:p>
       <w:pPr>
         <w:pStyle w:val="CommentText"/>
@@ -3360,27 +3362,27 @@
 
 <file path=word/commentsExtended.xml><?xml version="1.0" encoding="utf-8"?>
 <w15:commentsEx xmlns:wpc="http://schemas.microsoft.com/office/word/2010/wordprocessingCanvas" xmlns:cx="http://schemas.microsoft.com/office/drawing/2014/chartex" xmlns:cx1="http://schemas.microsoft.com/office/drawing/2015/9/8/chartex" xmlns:cx2="http://schemas.microsoft.com/office/drawing/2015/10/21/chartex" xmlns:cx3="http://schemas.microsoft.com/office/drawing/2016/5/9/chartex" xmlns:cx4="http://schemas.microsoft.com/office/drawing/2016/5/10/chartex" xmlns:cx5="http://schemas.microsoft.com/office/drawing/2016/5/11/chartex" xmlns:cx6="http://schemas.microsoft.com/office/drawing/2016/5/12/chartex" xmlns:cx7="http://schemas.microsoft.com/office/drawing/2016/5/13/chartex" xmlns:cx8="http://schemas.microsoft.com/office/drawing/2016/5/14/chartex" xmlns:mc="http://schemas.openxmlformats.org/markup-compatibility/2006" xmlns:m="http://schemas.openxmlformats.org/officeDocument/2006/math" xmlns:aink="http://schemas.microsoft.com/office/drawing/2016/ink" xmlns:am3d="http://schemas.microsoft.com/office/drawing/2017/model3d" xmlns:oel="http://schemas.microsoft.com/office/2019/extlst" xmlns:r="http://schemas.openxmlformats.org/officeDocument/2006/relationships" xmlns:wp14="http://schemas.microsoft.com/office/word/2010/wordprocessingDrawing" xmlns:wp="http://schemas.openxmlformats.org/drawingml/2006/wordprocessingDrawing" xmlns:wpg="http://schemas.microsoft.com/office/word/2010/wordprocessingGroup" xmlns:wpi="http://schemas.microsoft.com/office/word/2010/wordprocessingInk" xmlns:wps="http://schemas.microsoft.com/office/word/2010/wordprocessingShape" xmlns:o="urn:schemas-microsoft-com:office:office" xmlns:v="urn:schemas-microsoft-com:vml" xmlns:w10="urn:schemas-microsoft-com:office:word" xmlns:w="http://schemas.openxmlformats.org/wordprocessingml/2006/main" xmlns:w14="http://schemas.microsoft.com/office/word/2010/wordml" xmlns:w15="http://schemas.microsoft.com/office/word/2012/wordml" xmlns:w16cex="http://schemas.microsoft.com/office/word/2018/wordml/cex" xmlns:w16cid="http://schemas.microsoft.com/office/word/2016/wordml/cid" xmlns:w16="http://schemas.microsoft.com/office/word/2018/wordml" xmlns:w16sdtdh="http://schemas.microsoft.com/office/word/2020/wordml/sdtdatahash" xmlns:w16sdtfl="http://schemas.microsoft.com/office/word/2024/wordml/sdtformatlock" xmlns:w16se="http://schemas.microsoft.com/office/word/2015/wordml/symex" xmlns:w16du="http://schemas.microsoft.com/office/word/2023/wordml/word16du" xmlns:wne="http://schemas.microsoft.com/office/word/2006/wordml" mc:Ignorable="w14 w15 w16se w16cid w16 w16cex w16sdtdh w16sdtfl w16du wp14">
-  <w15:commentEx w15:paraId="00000001" w15:done="0"/>
-  <w15:commentEx w15:paraId="00000002" w15:paraIdParent="00000001" w15:done="0"/>
-  <w15:commentEx w15:paraId="597B2E91" w15:done="0"/>
+  <w15:commentEx w15:paraId="7C000000" w15:done="0"/>
+  <w15:commentEx w15:paraId="7C000001" w15:paraIdParent="7C000000" w15:done="0"/>
+  <w15:commentEx w15:paraId="59A669F5" w15:done="0"/>
 </w15:commentsEx>
 </file>
 
 <file path=word/commentsIds.xml><?xml version="1.0" encoding="utf-8"?>
 <w16cid:commentsIds xmlns:wpc="http://schemas.microsoft.com/office/word/2010/wordprocessingCanvas" xmlns:cx="http://schemas.microsoft.com/office/drawing/2014/chartex" xmlns:cx1="http://schemas.microsoft.com/office/drawing/2015/9/8/chartex" xmlns:cx2="http://schemas.microsoft.com/office/drawing/2015/10/21/chartex" xmlns:cx3="http://schemas.microsoft.com/office/drawing/2016/5/9/chartex" xmlns:cx4="http://schemas.microsoft.com/office/drawing/2016/5/10/chartex" xmlns:cx5="http://schemas.microsoft.com/office/drawing/2016/5/11/chartex" xmlns:cx6="http://schemas.microsoft.com/office/drawing/2016/5/12/chartex" xmlns:cx7="http://schemas.microsoft.com/office/drawing/2016/5/13/chartex" xmlns:cx8="http://schemas.microsoft.com/office/drawing/2016/5/14/chartex" xmlns:mc="http://schemas.openxmlformats.org/markup-compatibility/2006" xmlns:m="http://schemas.openxmlformats.org/officeDocument/2006/math" xmlns:aink="http://schemas.microsoft.com/office/drawing/2016/ink" xmlns:am3d="http://schemas.microsoft.com/office/drawing/2017/model3d" xmlns:oel="http://schemas.microsoft.com/office/2019/extlst" xmlns:r="http://schemas.openxmlformats.org/officeDocument/2006/relationships" xmlns:wp14="http://schemas.microsoft.com/office/word/2010/wordprocessingDrawing" xmlns:wp="http://schemas.openxmlformats.org/drawingml/2006/wordprocessingDrawing" xmlns:wpg="http://schemas.microsoft.com/office/word/2010/wordprocessingGroup" xmlns:wpi="http://schemas.microsoft.com/office/word/2010/wordprocessingInk" xmlns:wps="http://schemas.microsoft.com/office/word/2010/wordprocessingShape" xmlns:o="urn:schemas-microsoft-com:office:office" xmlns:v="urn:schemas-microsoft-com:vml" xmlns:w10="urn:schemas-microsoft-com:office:word" xmlns:w="http://schemas.openxmlformats.org/wordprocessingml/2006/main" xmlns:w14="http://schemas.microsoft.com/office/word/2010/wordml" xmlns:w15="http://schemas.microsoft.com/office/word/2012/wordml" xmlns:w16cex="http://schemas.microsoft.com/office/word/2018/wordml/cex" xmlns:w16cid="http://schemas.microsoft.com/office/word/2016/wordml/cid" xmlns:w16="http://schemas.microsoft.com/office/word/2018/wordml" xmlns:w16sdtdh="http://schemas.microsoft.com/office/word/2020/wordml/sdtdatahash" xmlns:w16sdtfl="http://schemas.microsoft.com/office/word/2024/wordml/sdtformatlock" xmlns:w16se="http://schemas.microsoft.com/office/word/2015/wordml/symex" xmlns:w16du="http://schemas.microsoft.com/office/word/2023/wordml/word16du" xmlns:wne="http://schemas.microsoft.com/office/word/2006/wordml" mc:Ignorable="w14 w15 w16se w16cid w16 w16cex w16sdtdh w16sdtfl w16du wp14">
-  <w16cid:commentId w16cid:paraId="00000001" w16cid:durableId="00000001"/>
-  <w16cid:commentId w16cid:paraId="00000002" w16cid:durableId="00000002"/>
-  <w16cid:commentId w16cid:paraId="597B2E91" w16cid:durableId="597B2E91"/>
+  <w16cid:commentId w16cid:paraId="7C000000" w16cid:durableId="7C000000"/>
+  <w16cid:commentId w16cid:paraId="7C000001" w16cid:durableId="7C000001"/>
+  <w16cid:commentId w16cid:paraId="59A669F5" w16cid:durableId="59A669F5"/>
 </w16cid:commentsIds>
 </file>
 
 <file path=word/numbering.xml><?xml version="1.0" encoding="utf-8"?>
 <w:numbering xmlns:wpc="http://schemas.microsoft.com/office/word/2010/wordprocessingCanvas" xmlns:cx="http://schemas.microsoft.com/office/drawing/2014/chartex" xmlns:cx1="http://schemas.microsoft.com/office/drawing/2015/9/8/chartex" xmlns:cx2="http://schemas.microsoft.com/office/drawing/2015/10/21/chartex" xmlns:cx3="http://schemas.microsoft.com/office/drawing/2016/5/9/chartex" xmlns:cx4="http://schemas.microsoft.com/office/drawing/2016/5/10/chartex" xmlns:cx5="http://schemas.microsoft.com/office/drawing/2016/5/11/chartex" xmlns:cx6="http://schemas.microsoft.com/office/drawing/2016/5/12/chartex" xmlns:cx7="http://schemas.microsoft.com/office/drawing/2016/5/13/chartex" xmlns:cx8="http://schemas.microsoft.com/office/drawing/2016/5/14/chartex" xmlns:mc="http://schemas.openxmlformats.org/markup-compatibility/2006" xmlns:m="http://schemas.openxmlformats.org/officeDocument/2006/math" xmlns:aink="http://schemas.microsoft.com/office/drawing/2016/ink" xmlns:am3d="http://schemas.microsoft.com/office/drawing/2017/model3d" xmlns:oel="http://schemas.microsoft.com/office/2019/extlst" xmlns:r="http://schemas.openxmlformats.org/officeDocument/2006/relationships" xmlns:wp14="http://schemas.microsoft.com/office/word/2010/wordprocessingDrawing" xmlns:wp="http://schemas.openxmlformats.org/drawingml/2006/wordprocessingDrawing" xmlns:wpg="http://schemas.microsoft.com/office/word/2010/wordprocessingGroup" xmlns:wpi="http://schemas.microsoft.com/office/word/2010/wordprocessingInk" xmlns:wps="http://schemas.microsoft.com/office/word/2010/wordprocessingShape" xmlns:o="urn:schemas-microsoft-com:office:office" xmlns:v="urn:schemas-microsoft-com:vml" xmlns:w10="urn:schemas-microsoft-com:office:word" xmlns:w="http://schemas.openxmlformats.org/wordprocessingml/2006/main" xmlns:w14="http://schemas.microsoft.com/office/word/2010/wordml" xmlns:w15="http://schemas.microsoft.com/office/word/2012/wordml" xmlns:w16cex="http://schemas.microsoft.com/office/word/2018/wordml/cex" xmlns:w16cid="http://schemas.microsoft.com/office/word/2016/wordml/cid" xmlns:w16="http://schemas.microsoft.com/office/word/2018/wordml" xmlns:w16sdtdh="http://schemas.microsoft.com/office/word/2020/wordml/sdtdatahash" xmlns:w16sdtfl="http://schemas.microsoft.com/office/word/2024/wordml/sdtformatlock" xmlns:w16se="http://schemas.microsoft.com/office/word/2015/wordml/symex" xmlns:w16du="http://schemas.microsoft.com/office/word/2023/wordml/word16du" xmlns:wne="http://schemas.microsoft.com/office/word/2006/wordml" mc:Ignorable="w14 w15 w16se w16cid w16 w16cex w16sdtdh w16sdtfl w16du wp14">
   <w:abstractNum w:abstractNumId="0" w15:restartNumberingAfterBreak="0">
-    <w:nsid w:val="0D3B4865"/>
+    <w:nsid w:val="70233D60"/>
     <w:multiLevelType w:val="hybridMultilevel"/>
-    <w:tmpl w:val="1EB2E76A"/>
-    <w:lvl w:ilvl="0" w:tplc="87BA7214">
+    <w:tmpl w:val="72B85DC8"/>
+    <w:lvl w:ilvl="0" w:tplc="188ACBA4">
       <w:start w:val="1"/>
       <w:numFmt w:val="decimal"/>
       <w:pStyle w:val="Heading1"/>
@@ -3405,7 +3407,7 @@
         <w:vertAlign w:val="baseline"/>
       </w:rPr>
     </w:lvl>
-    <w:lvl w:ilvl="1" w:tplc="CD605B5E">
+    <w:lvl w:ilvl="1" w:tplc="10781C0E">
       <w:start w:val="1"/>
       <w:numFmt w:val="lowerLetter"/>
       <w:lvlText w:val="%2"/>
@@ -3429,7 +3431,7 @@
         <w:vertAlign w:val="baseline"/>
       </w:rPr>
     </w:lvl>
-    <w:lvl w:ilvl="2" w:tplc="7DCEBE06">
+    <w:lvl w:ilvl="2" w:tplc="B45A98B8">
       <w:start w:val="1"/>
       <w:numFmt w:val="lowerRoman"/>
       <w:lvlText w:val="%3"/>
@@ -3453,7 +3455,7 @@
         <w:vertAlign w:val="baseline"/>
       </w:rPr>
     </w:lvl>
-    <w:lvl w:ilvl="3" w:tplc="A6243A44">
+    <w:lvl w:ilvl="3" w:tplc="7A56C7C6">
       <w:start w:val="1"/>
       <w:numFmt w:val="decimal"/>
       <w:lvlText w:val="%4"/>
@@ -3477,7 +3479,7 @@
         <w:vertAlign w:val="baseline"/>
       </w:rPr>
     </w:lvl>
-    <w:lvl w:ilvl="4" w:tplc="B74EDC4A">
+    <w:lvl w:ilvl="4" w:tplc="B4AE2EA2">
       <w:start w:val="1"/>
       <w:numFmt w:val="lowerLetter"/>
       <w:lvlText w:val="%5"/>
@@ -3501,7 +3503,7 @@
         <w:vertAlign w:val="baseline"/>
       </w:rPr>
     </w:lvl>
-    <w:lvl w:ilvl="5" w:tplc="8698EBCE">
+    <w:lvl w:ilvl="5" w:tplc="6C42A67E">
       <w:start w:val="1"/>
       <w:numFmt w:val="lowerRoman"/>
       <w:lvlText w:val="%6"/>
@@ -3525,7 +3527,7 @@
         <w:vertAlign w:val="baseline"/>
       </w:rPr>
     </w:lvl>
-    <w:lvl w:ilvl="6" w:tplc="C0A06502">
+    <w:lvl w:ilvl="6" w:tplc="A93E498C">
       <w:start w:val="1"/>
       <w:numFmt w:val="decimal"/>
       <w:lvlText w:val="%7"/>
@@ -3549,7 +3551,7 @@
         <w:vertAlign w:val="baseline"/>
       </w:rPr>
     </w:lvl>
-    <w:lvl w:ilvl="7" w:tplc="930239E6">
+    <w:lvl w:ilvl="7" w:tplc="0AEA2A10">
       <w:start w:val="1"/>
       <w:numFmt w:val="lowerLetter"/>
       <w:lvlText w:val="%8"/>
@@ -3573,7 +3575,7 @@
         <w:vertAlign w:val="baseline"/>
       </w:rPr>
     </w:lvl>
-    <w:lvl w:ilvl="8" w:tplc="803E37F4">
+    <w:lvl w:ilvl="8" w:tplc="FECA26FE">
       <w:start w:val="1"/>
       <w:numFmt w:val="lowerRoman"/>
       <w:lvlText w:val="%9"/>
@@ -3598,7 +3600,7 @@
       </w:rPr>
     </w:lvl>
   </w:abstractNum>
-  <w:num w:numId="1" w16cid:durableId="149367206">
+  <w:num w:numId="1" w16cid:durableId="1109934481">
     <w:abstractNumId w:val="0"/>
   </w:num>
 </w:numbering>
@@ -4118,7 +4120,7 @@
     <w:hidden/>
     <w:uiPriority w:val="99"/>
     <w:semiHidden/>
-    <w:rsid w:val="00155A20"/>
+    <w:rsid w:val="00F95A17"/>
     <w:pPr>
       <w:spacing w:after="0" w:line="240" w:lineRule="auto"/>
     </w:pPr>
@@ -4447,28 +4449,30 @@
 </file>
 
 <file path=customXml/item1.xml><?xml version="1.0" encoding="utf-8"?>
-<ns0:review xmlns:ns0="https://calkit.org/review" uuid="915b9c59-276f-474a-86cd-0f872ffb2e2b" source="paper/main.tex" rev="196d3b5cdb53211f4fa386a5c3448d3d4377a287">
+<ns0:review xmlns:ns0="https://calkit.org/review" uuid="fda50faf-787e-445d-88be-3f8817ab4a32" source="paper/main.tex">
   <ns0:p id="ck_defc3a7a_1">Wake recovery behind a model turbine</ns0:p>
-  <ns0:p id="ck_defc3a7a_1_2">P. BachantA. Reviewer</ns0:p>
+  <ns0:p id="ck_defc3a7a_1_2">P. Bachant A. Reviewer</ns0:p>
   <ns0:p id="ck_defc3a7a_10">Abstract</ns0:p>
   <ns0:p id="ck_defc3a7a_10_2">We study the wake of a model turbine. The flow is turbulent [Smith and Jones, 2020]. This is the abstract’s second sentence, which is fairly long so that it wraps across a couple of lines in the two-column layout.</ns0:p>
   <ns0:p id="ck_defc3a7a_16">Introduction</ns0:p>
-  <ns0:p id="ck_defc3a7a_23">Wakes matter for wind farm layout, as discussed by Smith and Jones [2020] and Lee [2018]. The flow is turbulent [Smith and Jones, 2020]. This paragraph contains an inline equation Re = UD/ν ≈ 105 and a hyphenated compound like “high-Reynolds-number” plus a non-breaking space and an em dash—like this one.</ns0:p>
+  <ns0:p id="ck_defc3a7a_19">Wakes matter for wind farm layout, as discussed by Smith and Jones [2020] and Lee [2018]. The flow is turbulent [Smith and Jones, 2020]. This paragraph contains an inline equation Re = UD/ν ≈ 105 and a hyphenated compound like “high-Reynolds-number” plus a non-breaking space and an em dash—like this one.</ns0:p>
   <ns0:p id="ck_dcf9e526_1">Methods</ns0:p>
   <ns0:p id="ck_dcf9e526_4">We measured the velocity field with a two-component laser Doppler velocimeter [Lee, 2018]. The sampling frequency was fs = 1 kHz and the integral time scale was estimated from the autocorrelation.</ns0:p>
-  <ns0:p id="ck_dcf9e526_13">The mean velocity deficit is modeled as</ns0:p>
-  <ns0:p id="ck_dcf9e526_17">where CT is the thrust coefficient and k is the wake growth rate. Figure 1 shows the result, and Table 1 lists the parameters.</ns0:p>
+  <ns0:p id="ck_dcf9e526_14">The mean velocity deficit is modeled as</ns0:p>
+  <ns0:p id="ck_dcf9e526_18">where CT is the thrust coefficient and k is the wake growth rate. Figure 1 shows the result, and Table 1 lists the parameters.</ns0:p>
   <ns0:p id="ck_defc3a7a_32">Figure 1: A sine wave, standing in for a wake profile.</ns0:p>
   <ns0:p id="ck_defc3a7a_38">Table 1: Parameters used in the wake model.</ns0:p>
-  <ns0:p id="ck_defc3a7a_40">Thrust coefficientCT0.8</ns0:p>
-  <ns0:p id="ck_defc3a7a_40_2">Growth ratek0.05</ns0:p>
+  <ns0:p id="ck_defc3a7a_40">Parameter Symbol Value</ns0:p>
+  <ns0:p id="ck_defc3a7a_40_2">Thrust coefficient CT 0.8</ns0:p>
+  <ns0:p id="ck_defc3a7a_40_3">Growth rate k 0.05</ns0:p>
   <ns0:p id="ck_defc3a7a_50">Conclusions</ns0:p>
   <ns0:p id="ck_defc3a7a_52">The model in Eq. (1) fits the data in Sec. 2 reasonably well.</ns0:p>
+  <ns0:media name="word/media/image1.png" sha1="d9d2ebbcd153e474fe0adb4e8fd78842a3d12d11"/>
 </ns0:review>
 </file>
 
 <file path=customXml/itemProps1.xml><?xml version="1.0" encoding="utf-8"?>
-<ds:datastoreItem xmlns:ds="http://schemas.openxmlformats.org/officeDocument/2006/customXml" ds:itemID="{0069F33C-63D0-6245-B0A5-056336D18F96}">
+<ds:datastoreItem xmlns:ds="http://schemas.openxmlformats.org/officeDocument/2006/customXml" ds:itemID="{26536890-5975-5446-8D43-94811A1C29EF}">
   <ds:schemaRefs>
     <ds:schemaRef ds:uri="https://calkit.org/review"/>
   </ds:schemaRefs>

</xml_diff>